<commit_message>
Fix diagrams by embedding Chrome-rendered PNGs instead of Mermaid SVG.
Mermaid SVG relies on CSS and foreignObject, so Word and system preview showed black blocks and missing arrows. Specs, Word, and PDF now use browser-rasterized PNG.
</commit_message>
<xml_diff>
--- a/06_defense/export/微服务拆分设计.docx
+++ b/06_defense/export/微服务拆分设计.docx
@@ -55,7 +55,7 @@
           <w:b w:val="0"/>
           <w:sz w:val="22"/>
         </w:rPr>
-        <w:t>详细接口、逐表归属和跨服务失败处理见 `微服务接口与数据归属.md`。服务划分图为 `images/33-MS-SPLIT.svg`。</w:t>
+        <w:t>详细接口、逐表归属和跨服务失败处理见 `微服务接口与数据归属.md`。服务划分图为 `images/png/33-MS-SPLIT.png`。</w:t>
       </w:r>
     </w:p>
     <w:p>
@@ -1486,7 +1486,7 @@
           <w:b w:val="0"/>
           <w:sz w:val="22"/>
         </w:rPr>
-        <w:t>- 服务划分图：`02_docs/images/33-MS-SPLIT.svg`</w:t>
+        <w:t>- 服务划分图：`02_docs/images/png/33-MS-SPLIT.png`（源：`02_docs/models/33-MS-SPLIT.mmd`）</w:t>
       </w:r>
     </w:p>
     <w:p>

</xml_diff>